<commit_message>
Resume: Lead Information Security Analyst @ Wells Fargo (MNC)
</commit_message>
<xml_diff>
--- a/resumes/Resume_Lead_Information_Security_Analyst_Wells_Fargo__MNC_.docx
+++ b/resumes/Resume_Lead_Information_Security_Analyst_Wells_Fargo__MNC_.docx
@@ -525,7 +525,7 @@
             <w:color w:val="000000"/>
             <w:u w:val="single"/>
           </w:rPr>
-          <w:t>SOC Automation and Threat Detection Lab</w:t>
+          <w:t>Lead Information Security Analyst</w:t>
         </w:r>
       </w:hyperlink>
       <w:r>
@@ -562,7 +562,7 @@
           <w:sz w:val="19"/>
           <w:szCs w:val="19"/>
         </w:rPr>
-        <w:t>Deployed Splunk SIEM with spl correlation (detection engineering) searches for brute-force detection (index=* failed | stats count by src_ip), lateral movement, and privilege escalation; mapped TTPs to mitre att&amp;ck (TTP mapping) (T1110, T1078, T1059) and wrote PICERL incident report.</w:t>
+        <w:t>Deployed Splunk SIEM with spl correlation (detection engineering) searches for brute-force detection (index=* failed | stats count by src_ip), lateral movement, and privilege escalation; mapped TTPs to mitre att&amp;ck (TTP mapping) (T1110, T1078, T1059) and wrote incident report.</w:t>
       </w:r>
     </w:p>
     <w:p>
@@ -581,7 +581,7 @@
           <w:sz w:val="19"/>
           <w:szCs w:val="19"/>
         </w:rPr>
-        <w:t>Built automated soar (security orchestration and automation)-style detection pipeline: Python script ingests Splunk alerts, runs ioc enrichment (threat intelligence) via VirusTotal API, and dispatches Telegram notifications with severity classification — reducing mean time to triage by automating repetitive L1 tasks.</w:t>
+        <w:t>Built automated soar (security orchestration and automation)-style detection pipeline: Python script ingests Splunk alerts, runs ioc enrichment (threat intelligence) via VirusTotal API, and dispatches Telegram notifications with severity classification — reducing mean time to triage by automating repetitive tasks.</w:t>
       </w:r>
     </w:p>
     <w:p>
@@ -698,7 +698,7 @@
           <w:sz w:val="19"/>
           <w:szCs w:val="19"/>
         </w:rPr>
-        <w:t>Built automated vulnerability assessment pipeline integrating Nessus and OpenVAS REST APIs in Python; generates CVE reports classified by cvss severity (vulnerability prioritisation); implemented epss scoring (exploit probability scoring) from FIRST.org API to prioritise by actual exploit probability — a metric rarely used by freshers.</w:t>
+        <w:t>Built automated vulnerability assessment pipeline integrating Nessus and OpenVAS REST APIs in Python; generates CVE reports classified by cvss severity (vulnerability prioritisation); implemented epss scoring (exploit probability scoring) from FIRST.org API to prioritise by actual exploit probability.</w:t>
       </w:r>
     </w:p>
     <w:p>
@@ -881,7 +881,7 @@
           <w:sz w:val="19"/>
           <w:szCs w:val="19"/>
         </w:rPr>
-        <w:t>Python, Bash (basic), regular expressions, security, risk, management</w:t>
+        <w:t>Python, Bash (basic), regular expressions, compliance, incident response, risk assessment</w:t>
       </w:r>
     </w:p>
     <w:p>

</xml_diff>